<commit_message>
docs: perbaikan deskripsi check_fragile dan format state tersimpan di laporan
</commit_message>
<xml_diff>
--- a/docs/Laporan Tugas Besar 1 IF3170 FrontierFolly.docx
+++ b/docs/Laporan Tugas Besar 1 IF3170 FrontierFolly.docx
@@ -4162,6 +4162,22 @@
           <w:rFonts w:ascii="IBM Plex Sans" w:hAnsi="IBM Plex Sans" w:cs="IBM Plex Sans" w:eastAsia="IBM Plex Sans"/>
           <w:sz w:val="24"/>
         </w:rPr>
+        <w:t>Saat disimpan ke berkas hasil pada folder output/, state dikonversi menjadi bentuk {"inside": {…paket yang termuat…}, "outside": […id paket di luar truk…], "value": …, "score": …} agar lebih ringkas dibaca.</w:t>
+      </w:r>
+    </w:p>
+    <w:p>
+      <w:pPr>
+        <w:spacing w:after="200" w:lineRule="auto"/>
+        <w:jc w:val="both"/>
+        <w:rPr>
+          <w:rFonts w:ascii="IBM Plex Sans" w:cs="IBM Plex Sans" w:eastAsia="IBM Plex Sans" w:hAnsi="IBM Plex Sans"/>
+        </w:rPr>
+      </w:pPr>
+      <w:r>
+        <w:rPr>
+          <w:rFonts w:ascii="IBM Plex Sans" w:hAnsi="IBM Plex Sans" w:cs="IBM Plex Sans" w:eastAsia="IBM Plex Sans"/>
+          <w:sz w:val="24"/>
+        </w:rPr>
         <w:t>Fungsi objektif yang dimaksimalkan adalah total value paket yang berada di dalam truk. packageScore memetakan sebuah paket ke skornya sesuai objective yang dipilih (value pada eksperimen utama, urgency pada bonus), sedangkan stateScore menjumlahkan skor seluruh paket yang berposisi tidak null:</w:t>
       </w:r>
     </w:p>
@@ -4382,7 +4398,7 @@
           <w:rFonts w:ascii="IBM Plex Sans" w:hAnsi="IBM Plex Sans" w:cs="IBM Plex Sans" w:eastAsia="IBM Plex Sans"/>
           <w:sz w:val="24"/>
         </w:rPr>
-        <w:t>Seluruh kandidat solusi divalidasi oleh fungsi state_valid yang menjalankan enam pengecekan: (1) check_orientation memastikan orientasi berupa permutasi yang sah; (2) check_bounds memastikan tidak ada bagian paket yang menembus dinding peti kemas; (3) check_collision memastikan tidak ada dua paket yang saling menembus, diperiksa dengan uji tumpang-tindih pada ketiga sumbu; (4) check_weight membatasi total berat muatan agar tidak melebihi max_capacity; (5) check_support melarang paket melayang, yaitu paket dengan z &gt; 0 wajib memiliki paket lain yang permukaan atasnya tepat berada di bawah alas paket tersebut; dan (6) check_fragile melarang barang pecah-belah menjadi penopang maupun berada di bawah paket lain.</w:t>
+        <w:t>Seluruh kandidat solusi divalidasi oleh fungsi state_valid yang menjalankan enam pengecekan: (1) check_orientation memastikan orientasi berupa permutasi yang sah; (2) check_bounds memastikan tidak ada bagian paket yang menembus dinding peti kemas; (3) check_collision memastikan tidak ada dua paket yang saling menembus, diperiksa dengan uji tumpang-tindih pada ketiga sumbu; (4) check_weight membatasi total berat muatan agar tidak melebihi max_capacity; (5) check_support melarang paket melayang, yaitu paket dengan z &gt; 0 wajib memiliki paket lain yang permukaan atasnya tepat berada di bawah alas paket tersebut; dan (6) check_fragile melarang barang pecah-belah menjadi penopang (alas) bagi paket lain.</w:t>
       </w:r>
     </w:p>
     <w:p>

</xml_diff>